<commit_message>
docs: add "Publish to GitHub" steps (create repo, gh auth, workflow scope, push)
Documents repo creation, gh account switch, the required `workflow` token
scope (gh auth refresh), and the workflow commit/push — in both README.md
and Lab10_Azure_Setup_Steps.docx. GitHub id masked as <your-github-id>.

Co-Authored-By: Claude Opus 4.8 <noreply@anthropic.com>
</commit_message>
<xml_diff>
--- a/Lab10_Azure_Setup_Steps.docx
+++ b/Lab10_Azure_Setup_Steps.docx
@@ -3502,6 +3502,153 @@
           <w:szCs w:val="18"/>
         </w:rPr>
         <w:t xml:space="preserve">Figure 1 — the pipeline: build -&gt; ACR -&gt; deploy GREEN at 0% -&gt; eval gate -&gt; promote or block.</w:t>
+      </w:r>
+    </w:p>
+    <w:p>
+      <w:pPr>
+        <w:pStyle w:val="Heading2"/>
+      </w:pPr>
+      <w:r>
+        <w:t>6.0 Publish the repo to GitHub</w:t>
+      </w:r>
+    </w:p>
+    <w:p>
+      <w:r>
+        <w:t>The CI/CD pipeline runs from your own GitHub repo, so publish the lab there first. GitHub blocks pushing files under .github/workflows/ unless the gh token carries the 'workflow' scope — grant it, then push.</w:t>
+      </w:r>
+    </w:p>
+    <w:p>
+      <w:r>
+        <w:rPr>
+          <w:rFonts w:ascii="Consolas" w:hAnsi="Consolas" w:cs="Consolas"/>
+          <w:sz w:val="18"/>
+        </w:rPr>
+        <w:t># 1) create the repo on GitHub (public) under your account</w:t>
+      </w:r>
+    </w:p>
+    <w:p>
+      <w:r>
+        <w:rPr>
+          <w:rFonts w:ascii="Consolas" w:hAnsi="Consolas" w:cs="Consolas"/>
+          <w:sz w:val="18"/>
+        </w:rPr>
+        <w:t>gh repo create &lt;your-github-id&gt;/azure-ai-labs-10abc --public --source . --remote origin</w:t>
+      </w:r>
+    </w:p>
+    <w:p>
+      <w:r>
+        <w:rPr>
+          <w:rFonts w:ascii="Consolas" w:hAnsi="Consolas" w:cs="Consolas"/>
+          <w:sz w:val="18"/>
+        </w:rPr>
+        <w:t>#    (or create it in the GitHub UI, then:</w:t>
+      </w:r>
+    </w:p>
+    <w:p>
+      <w:r>
+        <w:rPr>
+          <w:rFonts w:ascii="Consolas" w:hAnsi="Consolas" w:cs="Consolas"/>
+          <w:sz w:val="18"/>
+        </w:rPr>
+        <w:t>#     git init -b main &amp;&amp; git remote add origin \</w:t>
+      </w:r>
+    </w:p>
+    <w:p>
+      <w:r>
+        <w:rPr>
+          <w:rFonts w:ascii="Consolas" w:hAnsi="Consolas" w:cs="Consolas"/>
+          <w:sz w:val="18"/>
+        </w:rPr>
+        <w:t>#       https://github.com/&lt;your-github-id&gt;/azure-ai-labs-10abc.git)</w:t>
+      </w:r>
+    </w:p>
+    <w:p/>
+    <w:p>
+      <w:r>
+        <w:rPr>
+          <w:rFonts w:ascii="Consolas" w:hAnsi="Consolas" w:cs="Consolas"/>
+          <w:sz w:val="18"/>
+        </w:rPr>
+        <w:t># 2) point gh at the account that owns the repo</w:t>
+      </w:r>
+    </w:p>
+    <w:p>
+      <w:r>
+        <w:rPr>
+          <w:rFonts w:ascii="Consolas" w:hAnsi="Consolas" w:cs="Consolas"/>
+          <w:sz w:val="18"/>
+        </w:rPr>
+        <w:t>gh auth switch --user &lt;your-github-id&gt;</w:t>
+      </w:r>
+    </w:p>
+    <w:p/>
+    <w:p>
+      <w:r>
+        <w:rPr>
+          <w:rFonts w:ascii="Consolas" w:hAnsi="Consolas" w:cs="Consolas"/>
+          <w:sz w:val="18"/>
+        </w:rPr>
+        <w:t># 3) grant the token the 'workflow' scope (needed for .github/workflows/*)</w:t>
+      </w:r>
+    </w:p>
+    <w:p>
+      <w:r>
+        <w:rPr>
+          <w:rFonts w:ascii="Consolas" w:hAnsi="Consolas" w:cs="Consolas"/>
+          <w:sz w:val="18"/>
+        </w:rPr>
+        <w:t>gh auth refresh -h github.com -u &lt;your-github-id&gt; -s workflow</w:t>
+      </w:r>
+    </w:p>
+    <w:p/>
+    <w:p>
+      <w:r>
+        <w:rPr>
+          <w:rFonts w:ascii="Consolas" w:hAnsi="Consolas" w:cs="Consolas"/>
+          <w:sz w:val="18"/>
+        </w:rPr>
+        <w:t># 4) commit and push the CI/CD workflow</w:t>
+      </w:r>
+    </w:p>
+    <w:p>
+      <w:r>
+        <w:rPr>
+          <w:rFonts w:ascii="Consolas" w:hAnsi="Consolas" w:cs="Consolas"/>
+          <w:sz w:val="18"/>
+        </w:rPr>
+        <w:t>cd /Users/vrln/fde-training/Batch-1/prep/Azure-AI-Labs-10ABC</w:t>
+      </w:r>
+    </w:p>
+    <w:p>
+      <w:r>
+        <w:rPr>
+          <w:rFonts w:ascii="Consolas" w:hAnsi="Consolas" w:cs="Consolas"/>
+          <w:sz w:val="18"/>
+        </w:rPr>
+        <w:t>git add .github/workflows/deploy.yml</w:t>
+      </w:r>
+    </w:p>
+    <w:p>
+      <w:r>
+        <w:rPr>
+          <w:rFonts w:ascii="Consolas" w:hAnsi="Consolas" w:cs="Consolas"/>
+          <w:sz w:val="18"/>
+        </w:rPr>
+        <w:t>git commit -m "ci: add Container Apps blue/green deploy workflow"</w:t>
+      </w:r>
+    </w:p>
+    <w:p>
+      <w:r>
+        <w:rPr>
+          <w:rFonts w:ascii="Consolas" w:hAnsi="Consolas" w:cs="Consolas"/>
+          <w:sz w:val="18"/>
+        </w:rPr>
+        <w:t>git push -u origin main</w:t>
+      </w:r>
+    </w:p>
+    <w:p>
+      <w:r>
+        <w:t>If the push is rejected with "refusing to allow an OAuth App to create or update workflow ... without workflow scope", step 3 was skipped — run it (interactive browser/device auth) and push again.</w:t>
       </w:r>
     </w:p>
     <w:p>

</xml_diff>